<commit_message>
Update resumes and final portfolio tweaks
</commit_message>
<xml_diff>
--- a/public/Aksharajsinh_Resume_Fintech.docx
+++ b/public/Aksharajsinh_Resume_Fintech.docx
@@ -30,7 +30,7 @@
     <w:p>
       <w:pPr>
         <w:spacing w:before="46"/>
-        <w:ind w:left="1440"/>
+        <w:ind w:left="1760"/>
         <w:rPr>
           <w:sz w:val="20"/>
           <w:szCs w:val="20"/>
@@ -263,15 +263,16 @@
         </w:rPr>
         <w:t xml:space="preserve"> </w:t>
       </w:r>
-      <w:r>
-        <w:rPr>
-          <w:color w:val="0066CC"/>
-          <w:spacing w:val="-2"/>
-          <w:sz w:val="20"/>
-          <w:szCs w:val="20"/>
-        </w:rPr>
-        <w:t>Portfolio</w:t>
-      </w:r>
+      <w:hyperlink r:id="rId8" w:history="1">
+        <w:r>
+          <w:rPr>
+            <w:color w:val="0066CC"/>
+            <w:sz w:val="20"/>
+            <w:szCs w:val="20"/>
+          </w:rPr>
+          <w:t>Portfolio</w:t>
+        </w:r>
+      </w:hyperlink>
     </w:p>
     <w:p>
       <w:pPr>
@@ -282,7 +283,21 @@
         <w:rPr>
           <w:spacing w:val="-2"/>
         </w:rPr>
-        <w:t>Fintech &amp; Data Analyst with 1+ year of experience building AI-assisted workflow tools, analytics dashboards, and structured data systems across enterprise and multi-market environments. Focused on public markets, financial data infrastructure, and using Python, SQL, and BI tools to improve research, reporting, and operational workflows. Experienced in stakeholder alignment, process automation, UAT, and delivering measurable efficiency gains</w:t>
+        <w:t xml:space="preserve">Fintech &amp; Data Analyst with 1+ </w:t>
+      </w:r>
+      <w:proofErr w:type="gramStart"/>
+      <w:r>
+        <w:rPr>
+          <w:spacing w:val="-2"/>
+        </w:rPr>
+        <w:t>year</w:t>
+      </w:r>
+      <w:proofErr w:type="gramEnd"/>
+      <w:r>
+        <w:rPr>
+          <w:spacing w:val="-2"/>
+        </w:rPr>
+        <w:t xml:space="preserve"> of experience building AI-assisted workflow tools, analytics dashboards, and structured data systems across enterprise and multi-market environments. Focused on public markets, financial data infrastructure, and using Python, SQL, and BI tools to improve research, reporting, and operational workflows. Experienced in stakeholder alignment, process automation, UAT, and delivering measurable efficiency gains</w:t>
       </w:r>
       <w:r>
         <w:t>.</w:t>
@@ -662,6 +677,9 @@
         </w:rPr>
       </w:pPr>
       <w:r>
+        <w:rPr>
+          <w:noProof/>
+        </w:rPr>
         <mc:AlternateContent>
           <mc:Choice Requires="wps">
             <w:drawing>
@@ -755,7 +773,7 @@
           <w:bCs w:val="0"/>
           <w:szCs w:val="22"/>
         </w:rPr>
-        <w:t>: Financial Data Analysis, Public Markets Research, Investment Research, Capital Markets &amp; Trading Operations, Risk Analysis, Forecasting &amp; Trend Analysis, Market Data Workflows, Reconciliation, KPI Design</w:t>
+        <w:t xml:space="preserve">: Financial Data Analysis, Public Markets Research, Investment Research, Capital Markets &amp; Trading Operations, Risk Analysis, Forecasting &amp; Trend Analysis, Market Data Workflows, Reconciliation, KPI Design. </w:t>
       </w:r>
       <w:r>
         <w:rPr>
@@ -763,7 +781,13 @@
           <w:bCs w:val="0"/>
           <w:szCs w:val="22"/>
         </w:rPr>
-        <w:t xml:space="preserve">. </w:t>
+        <w:br/>
+      </w:r>
+      <w:r>
+        <w:rPr>
+          <w:szCs w:val="22"/>
+        </w:rPr>
+        <w:t>Data &amp; Analytics</w:t>
       </w:r>
       <w:r>
         <w:rPr>
@@ -771,13 +795,7 @@
           <w:bCs w:val="0"/>
           <w:szCs w:val="22"/>
         </w:rPr>
-        <w:br/>
-      </w:r>
-      <w:r>
-        <w:rPr>
-          <w:szCs w:val="22"/>
-        </w:rPr>
-        <w:t>Data &amp; Analytics</w:t>
+        <w:t>: SQL, Python, Pandas, NumPy, Excel (Advanced), Power BI, Microsoft Fabric, Tableau, Dashboard Reporting, Data Visualization, Process Automation, Statistical Analysis</w:t>
       </w:r>
       <w:r>
         <w:rPr>
@@ -785,7 +803,13 @@
           <w:bCs w:val="0"/>
           <w:szCs w:val="22"/>
         </w:rPr>
-        <w:t>: SQL, Python, Pandas, NumPy, Excel (Advanced), Power BI, Microsoft Fabric, Tableau, Dashboard Reporting, Data Visualization, Process Automation, Statistical Analysis</w:t>
+        <w:br/>
+      </w:r>
+      <w:r>
+        <w:rPr>
+          <w:szCs w:val="22"/>
+        </w:rPr>
+        <w:t>Quant &amp; Research Systems</w:t>
       </w:r>
       <w:r>
         <w:rPr>
@@ -793,13 +817,7 @@
           <w:bCs w:val="0"/>
           <w:szCs w:val="22"/>
         </w:rPr>
-        <w:br/>
-      </w:r>
-      <w:r>
-        <w:rPr>
-          <w:szCs w:val="22"/>
-        </w:rPr>
-        <w:t>Quant &amp; Research Systems</w:t>
+        <w:t>: Backtesting, Brier Scoring, Scenario Analysis, Probability Forecasting, Time-Series Analysis, Forecast Calibration, Signal Tracking, Model Evaluation, Research Logging, Prediction Market Analysis</w:t>
       </w:r>
       <w:r>
         <w:rPr>
@@ -807,7 +825,13 @@
           <w:bCs w:val="0"/>
           <w:szCs w:val="22"/>
         </w:rPr>
-        <w:t>: Backtesting, Brier Scoring, Scenario Analysis, Probability Forecasting, Time-Series Analysis, Forecast Calibration, Signal Tracking, Model Evaluation, Research Logging, Prediction Market Analysis</w:t>
+        <w:br/>
+      </w:r>
+      <w:r>
+        <w:rPr>
+          <w:szCs w:val="22"/>
+        </w:rPr>
+        <w:t>AI &amp; Automation</w:t>
       </w:r>
       <w:r>
         <w:rPr>
@@ -815,13 +839,7 @@
           <w:bCs w:val="0"/>
           <w:szCs w:val="22"/>
         </w:rPr>
-        <w:br/>
-      </w:r>
-      <w:r>
-        <w:rPr>
-          <w:szCs w:val="22"/>
-        </w:rPr>
-        <w:t>AI &amp; Automation</w:t>
+        <w:t>: Azure AI Foundry, LLM Workflows, Prompt Engineering, RAG, LangChain, LangGraph, CrewAI, n8n, Power Automate, MCP, Agentic AI Workflows</w:t>
       </w:r>
       <w:r>
         <w:rPr>
@@ -829,7 +847,13 @@
           <w:bCs w:val="0"/>
           <w:szCs w:val="22"/>
         </w:rPr>
-        <w:t>: Azure AI Foundry, LLM Workflows, Prompt Engineering, RAG, LangChain, LangGraph, CrewAI, n8n, Power Automate, MCP, Agentic AI Workflows</w:t>
+        <w:br/>
+      </w:r>
+      <w:r>
+        <w:rPr>
+          <w:szCs w:val="22"/>
+        </w:rPr>
+        <w:t>Programming &amp; Tools</w:t>
       </w:r>
       <w:r>
         <w:rPr>
@@ -837,20 +861,6 @@
           <w:bCs w:val="0"/>
           <w:szCs w:val="22"/>
         </w:rPr>
-        <w:br/>
-      </w:r>
-      <w:r>
-        <w:rPr>
-          <w:szCs w:val="22"/>
-        </w:rPr>
-        <w:t>Programming &amp; Tools</w:t>
-      </w:r>
-      <w:r>
-        <w:rPr>
-          <w:b w:val="0"/>
-          <w:bCs w:val="0"/>
-          <w:szCs w:val="22"/>
-        </w:rPr>
         <w:t>: Python, SQL, JavaScript, Java, C++, R, PostgreSQL, MS SQL, MongoDB, Redis, Qdrant, FastAPI, Streamlit, Git/GitHub, Docker, Jira, Confluence, Notion, Figma, Miro</w:t>
       </w:r>
     </w:p>
@@ -859,6 +869,9 @@
         <w:pStyle w:val="Heading1"/>
       </w:pPr>
       <w:r>
+        <w:rPr>
+          <w:noProof/>
+        </w:rPr>
         <mc:AlternateContent>
           <mc:Choice Requires="wps">
             <w:drawing>
@@ -964,7 +977,13 @@
         <w:rPr>
           <w:b/>
         </w:rPr>
-        <w:tab/>
+        <w:t xml:space="preserve">                                                                                    </w:t>
+      </w:r>
+      <w:r>
+        <w:rPr>
+          <w:b/>
+        </w:rPr>
+        <w:t xml:space="preserve">    </w:t>
       </w:r>
       <w:r>
         <w:rPr>
@@ -996,7 +1015,7 @@
         <w:rPr>
           <w:sz w:val="20"/>
         </w:rPr>
-        <w:t>–</w:t>
+        <w:t>-</w:t>
       </w:r>
       <w:r>
         <w:rPr>
@@ -1067,14 +1086,7 @@
           <w:b/>
           <w:sz w:val="20"/>
         </w:rPr>
-        <w:t xml:space="preserve">                               </w:t>
-      </w:r>
-      <w:r>
-        <w:rPr>
-          <w:spacing w:val="-8"/>
-          <w:sz w:val="20"/>
-        </w:rPr>
-        <w:t xml:space="preserve"> </w:t>
+        <w:t xml:space="preserve">                             </w:t>
       </w:r>
       <w:r>
         <w:rPr>
@@ -1259,6 +1271,13 @@
       </w:r>
       <w:r>
         <w:rPr>
+          <w:b/>
+          <w:sz w:val="20"/>
+        </w:rPr>
+        <w:t xml:space="preserve"> </w:t>
+      </w:r>
+      <w:r>
+        <w:rPr>
           <w:sz w:val="20"/>
         </w:rPr>
         <w:t>Jan</w:t>
@@ -1287,7 +1306,7 @@
         <w:rPr>
           <w:sz w:val="20"/>
         </w:rPr>
-        <w:t>–</w:t>
+        <w:t>-</w:t>
       </w:r>
       <w:r>
         <w:rPr>
@@ -1323,7 +1342,7 @@
           <w:sz w:val="20"/>
           <w:lang w:val="en-CA"/>
         </w:rPr>
-        <w:t xml:space="preserve">  Product Manager Intern</w:t>
+        <w:t xml:space="preserve">  </w:t>
       </w:r>
       <w:r>
         <w:rPr>
@@ -1331,7 +1350,31 @@
           <w:sz w:val="20"/>
           <w:lang w:val="en-CA"/>
         </w:rPr>
+        <w:t xml:space="preserve">  </w:t>
+      </w:r>
+      <w:r>
+        <w:rPr>
+          <w:b/>
+          <w:sz w:val="20"/>
+          <w:lang w:val="en-CA"/>
+        </w:rPr>
+        <w:t>Product Manager Intern</w:t>
+      </w:r>
+      <w:r>
+        <w:rPr>
+          <w:b/>
+          <w:sz w:val="20"/>
+          <w:lang w:val="en-CA"/>
+        </w:rPr>
         <w:tab/>
+      </w:r>
+      <w:r>
+        <w:rPr>
+          <w:b/>
+          <w:sz w:val="20"/>
+          <w:lang w:val="en-CA"/>
+        </w:rPr>
+        <w:t xml:space="preserve">   </w:t>
       </w:r>
       <w:r>
         <w:rPr>
@@ -1938,16 +1981,7 @@
           <w:iCs/>
           <w:sz w:val="20"/>
         </w:rPr>
-        <w:t>LangGraph</w:t>
-      </w:r>
-      <w:r>
-        <w:rPr>
-          <w:bCs/>
-          <w:i/>
-          <w:iCs/>
-          <w:sz w:val="20"/>
-        </w:rPr>
-        <w:t>, CrewAI, Python, yfinance, PostgreSQL, FastAPI</w:t>
+        <w:t>LangGraph, CrewAI, Python, yfinance, PostgreSQL, FastAPI</w:t>
       </w:r>
       <w:r>
         <w:rPr>
@@ -3212,6 +3246,7 @@
   <w:style w:type="character" w:default="1" w:styleId="DefaultParagraphFont">
     <w:name w:val="Default Paragraph Font"/>
     <w:uiPriority w:val="1"/>
+    <w:semiHidden/>
     <w:unhideWhenUsed/>
   </w:style>
   <w:style w:type="table" w:default="1" w:styleId="TableNormal">

</xml_diff>